<commit_message>
Synchronize published status, reports, deck and independently accepted FP32 demo
</commit_message>
<xml_diff>
--- a/reports/01_AI工程实践主报告.docx
+++ b/reports/01_AI工程实践主报告.docx
@@ -652,7 +652,7 @@
           <w:b w:val="0"/>
           <w:sz w:val="22"/>
         </w:rPr>
-        <w:t>项目最终形成模型与评价记录、数据探索、AI使用日志、离线演示及版本化材料。本文将自动计算、AI辅助审查、人工决策和设备验收分层说明；缺少患者／切片ID、仅一个外部中心、没有无AI开发对照，以及若干课程覆盖差异仍然保留。新的教师提交仓库内容已另行整理，但云端创建、上传、CI及教师访问授权需完成后才能记为成功。[S20–S21]</w:t>
+        <w:t>项目最终形成模型与评价记录、数据探索、AI使用日志、离线演示及版本化材料。本文将自动计算、AI辅助审查、人工决策和设备验收分层说明；缺少患者／切片ID、仅一个外部中心、没有无AI开发对照，以及若干课程覆盖差异仍然保留。2026年10月19日已创建独立私有教师仓库并上传，补齐原演示资产、验收新副本并通过真实CI；教师访问授权仍待确认。[S20–S21]</w:t>
       </w:r>
     </w:p>
     <w:p>
@@ -7279,7 +7279,7 @@
                 <w:b w:val="0"/>
                 <w:sz w:val="20"/>
               </w:rPr>
-              <w:t>demo说明 → 补齐原FP32和样例 → 安装依赖 → 本地预测</w:t>
+              <w:t>demo说明 → 校验原FP32和样例 → 安装依赖 → 本地预测</w:t>
             </w:r>
           </w:p>
         </w:tc>
@@ -7352,7 +7352,7 @@
           <w:b w:val="0"/>
           <w:sz w:val="22"/>
         </w:rPr>
-        <w:t>目前已在本地准备教师提交文件；新私有仓库创建、发布、云端CI和教师账号访问仍待Codex在有权限的工作区完成。当前包不包含FP32权重及真实PNG样例，不能称为开箱即用演示包。移交时须将必要演示资产复制至新仓库或其私有Release，不能要求老师另获原仓库访问权才能使用基本交付。[S21]</w:t>
+        <w:t>独立私有教师仓库Wenhow1/pathmnist-ai-practice-submission已创建并上传。FP32模型及10张固定PNG已按原哈希补齐，新副本在Mac独立环境完成20项检查与4项浏览器验收。真实CI只查文件和保存结果算术，不执行模型。必要运行资产可从新库获得；教师账号授权与课堂设备仍待确认。[S21]</w:t>
       </w:r>
     </w:p>
     <w:p>
@@ -7379,7 +7379,7 @@
           <w:b w:val="0"/>
           <w:sz w:val="22"/>
         </w:rPr>
-        <w:t>已有CLI、审计脚本、恢复原型、演示程序和打包逻辑具有复用价值，但并不自动等于正式Agent Skill。当前没有可追溯的项目专用local/global Skill调用记录，因此不列为已使用成果；这也不等于断言所有平台都从未使用任何内部通用能力。新CI配置属于提交阶段新增文件，只有取得真实workflow运行才可称云端检查通过。</w:t>
+        <w:t>已有CLI、审计脚本、恢复原型、演示程序和打包逻辑具有复用价值，但并不自动等于正式Agent Skill。当前没有可追溯的项目专用local/global Skill调用记录，因此不列为已使用成果；这也不等于断言所有平台都从未使用任何内部通用能力。提交阶段新增CI已有真实通过记录，仅检查文件与保存结果算术，不属于原训练期成果。</w:t>
       </w:r>
     </w:p>
     <w:p>
@@ -7806,7 +7806,7 @@
                 <w:b w:val="0"/>
                 <w:sz w:val="20"/>
               </w:rPr>
-              <w:t>历史无Actions运行证据；新配置已准备，云端执行待完成</w:t>
+              <w:t>原训练期无Actions证据；提交期真实CI通过，仅查文件与算术</w:t>
             </w:r>
           </w:p>
         </w:tc>
@@ -8547,7 +8547,7 @@
                 <w:b w:val="0"/>
                 <w:sz w:val="20"/>
               </w:rPr>
-              <w:t>本提交内容的本地核查与云端待完成状态</w:t>
+              <w:t>本提交的文件核查、新副本运行与真实云端发布记录</w:t>
             </w:r>
           </w:p>
         </w:tc>
@@ -8563,7 +8563,7 @@
           <w:b w:val="0"/>
           <w:sz w:val="22"/>
         </w:rPr>
-        <w:t>历史来源文件中的“当前”“只在服务器”等措辞描述当时状态；不以它们替代新提交状态。正式数据和权重依然来自原固定实验，本轮未训练、未推理官方测试、未改变结果。教师提交仓库发布后，应更新S21中的仓库地址、真实commit和CI运行标识，不能预填成功状态。</w:t>
+        <w:t>历史来源文件中的“当前”“只在服务器”等措辞描述当时状态；不以它们替代新提交状态。正式数据和权重依然来自原固定实验，本轮未训练、未推理官方测试、未改变结果。发布接手已更新S21中的仓库、运行记录和真实CI链接；Release与提交SHA以云端回执为准，教师访问仍待验收。</w:t>
       </w:r>
     </w:p>
     <w:sectPr>

</xml_diff>

<commit_message>
Complete member roles and publish public teacher submission
</commit_message>
<xml_diff>
--- a/reports/01_AI工程实践主报告.docx
+++ b/reports/01_AI工程实践主报告.docx
@@ -238,7 +238,7 @@
                 <w:b w:val="0"/>
                 <w:sz w:val="20"/>
               </w:rPr>
-              <w:t>王张文皓</w:t>
+              <w:t>王张文皓（12615035）</w:t>
             </w:r>
           </w:p>
         </w:tc>
@@ -295,7 +295,7 @@
                 <w:b w:val="0"/>
                 <w:sz w:val="20"/>
               </w:rPr>
-              <w:t>赵昱淳、李以祺、朱逸枫（沿用用户上传PPT）</w:t>
+              <w:t xml:space="preserve">赵昱淳（12615027）、李以祺（22615003）、朱逸枫（12615026）</w:t>
             </w:r>
           </w:p>
         </w:tc>
@@ -352,7 +352,7 @@
                 <w:b w:val="0"/>
                 <w:sz w:val="20"/>
               </w:rPr>
-              <w:t>待本人／小组按实际填写，不由AI推测</w:t>
+              <w:t xml:space="preserve">代码实现：王张文皓；规划：赵昱淳；测试整理：李以祺；云端报告：朱逸枫</w:t>
             </w:r>
           </w:p>
         </w:tc>
@@ -652,7 +652,7 @@
           <w:b w:val="0"/>
           <w:sz w:val="22"/>
         </w:rPr>
-        <w:t>项目最终形成模型与评价记录、数据探索、AI使用日志、离线演示及版本化材料。本文将自动计算、AI辅助审查、人工决策和设备验收分层说明；缺少患者／切片ID、仅一个外部中心、没有无AI开发对照，以及若干课程覆盖差异仍然保留。2026年10月19日已创建独立私有教师仓库并上传，补齐原演示资产、验收新副本并通过真实CI；教师访问授权仍待确认。[S20–S21]</w:t>
+        <w:t xml:space="preserve">项目最终形成模型与评价记录、数据探索、AI使用日志、离线演示及版本化材料。本文将自动计算、AI辅助审查、人工决策和设备验收分层说明；缺少患者／切片ID、仅一个外部中心、没有无AI开发对照，以及若干课程覆盖差异仍然保留。2026年10月19日已发布独立教师仓库，补齐原演示资产、验收新副本并通过真实CI；按小组决定公开，无需账号邀请。[S20–S21]</w:t>
       </w:r>
     </w:p>
     <w:p>
@@ -1376,7 +1376,7 @@
           <w:b w:val="0"/>
           <w:sz w:val="22"/>
         </w:rPr>
-        <w:t>人的责任主要表现为目标和风险取舍：指定只操作本人项目目录、批准阶段推进、决定不盲目增加模型与轮数、接受未解决的数据限制，并确认报告能表达什么。某条日志只写“人工修订”而没有姓名时，本报告不把它归给某位组员。正式分工表应由本人依据真实操作补齐，不能让AI按常见分工模板分配贡献。[S02、S14、S20]</w:t>
+        <w:t xml:space="preserve">人的责任主要表现为目标和风险取舍：指定只操作本人项目目录、批准阶段推进、决定不盲目增加模型与轮数、接受未解决的数据限制，并确认报告能表达什么。某条日志只写“人工修订”而没有姓名时，本报告不把它归给某位组员。成员分工已由小组补充，见第8.3节；未署名的历史操作仍不逐项归给个人。[S02、S14、S20]</w:t>
       </w:r>
     </w:p>
     <w:p>
@@ -4556,7 +4556,7 @@
           <w:b w:val="0"/>
           <w:sz w:val="22"/>
         </w:rPr>
-        <w:t>历史记录中的一些图表由Codex目视检查，不能称为病理专家人工复核。小组应在提交前核对实际成员、学号、本人贡献、课程要求和现场显示；未得到记录的确认状态保持未确认。医学解释没有专家证据时只描述数据标签与模型混淆，不依据病理图像外观改写真实标签。[S02、S14、S20]</w:t>
+        <w:t xml:space="preserve">历史记录中的一些图表由Codex目视检查，不能称为病理专家人工复核。成员、学号与责任范围已由小组补充；未留记录的操作仍不虚构署名。用户决定以可打开的PPT提交，不要求现场投影验收。医学解释没有专家证据时只描述数据标签与模型混淆，不依据病理图像外观改写真实标签。[S02、S14、S20]</w:t>
       </w:r>
     </w:p>
     <w:p>
@@ -5481,7 +5481,7 @@
           <w:b w:val="0"/>
           <w:sz w:val="22"/>
         </w:rPr>
-        <w:t>原日志未把“人工审查”署名到个人，本报告也不替任何成员认领。真实个人贡献留待补齐。</w:t>
+        <w:t xml:space="preserve">原日志未把“人工审查”署名到个人，本报告也不替任何成员认领。成员责任范围已由小组补充。</w:t>
       </w:r>
     </w:p>
     <w:p>
@@ -7352,7 +7352,7 @@
           <w:b w:val="0"/>
           <w:sz w:val="22"/>
         </w:rPr>
-        <w:t>独立私有教师仓库Wenhow1/pathmnist-ai-practice-submission已创建并上传。FP32模型及10张固定PNG已按原哈希补齐，新副本在Mac独立环境完成20项检查与4项浏览器验收。真实CI只查文件和保存结果算术，不执行模型。必要运行资产可从新库获得；教师账号授权与课堂设备仍待确认。[S21]</w:t>
+        <w:t xml:space="preserve">独立教师仓库Wenhow1/pathmnist-ai-practice-submission已上传，并按小组决定公开。FP32模型及10张固定PNG已按原哈希补齐，新副本在Mac独立环境完成20项检查与4项浏览器验收。真实CI只查文件和保存结果算术，不执行模型。必要运行资产可从新库获得，无需邀请。PPT保留可打开的文件与PDF；现场投影不列为本次要求。[S21]</w:t>
       </w:r>
     </w:p>
     <w:p>
@@ -7906,7 +7906,7 @@
           <w:b w:val="0"/>
           <w:sz w:val="22"/>
         </w:rPr>
-        <w:t>已知成员姓名沿用用户上传PPT；学号、具体操作与贡献由成员本人确认。报告不按常见模板虚构数据清洗、专家审核、逐行编码或独立复算的个人经历。AI生成和修改的部分如实保留，人的目标、范围与最终取舍也不被省略。</w:t>
+        <w:t xml:space="preserve">王张文皓（12615035）负责代码与技术实现；赵昱淳（12615027）负责项目规划；李以祺（22615003）负责后端测试与代码整理；朱逸枫（12615026）负责云端维护与报告整理。分工依据小组提供的信息；AI参与实现与自动执行按日志如实保留，不将未署名的历史操作归给个人，也不编造工时或贡献比例。</w:t>
       </w:r>
     </w:p>
     <w:p>
@@ -8563,7 +8563,7 @@
           <w:b w:val="0"/>
           <w:sz w:val="22"/>
         </w:rPr>
-        <w:t>历史来源文件中的“当前”“只在服务器”等措辞描述当时状态；不以它们替代新提交状态。正式数据和权重依然来自原固定实验，本轮未训练、未推理官方测试、未改变结果。发布接手已更新S21中的仓库、运行记录和真实CI链接；Release与提交SHA以云端回执为准，教师访问仍待验收。</w:t>
+        <w:t xml:space="preserve">历史来源文件中的“当前”“只在服务器”等措辞描述当时状态；不以它们替代新提交状态。正式数据和权重依然来自原固定实验，本轮未训练、未推理官方测试、未改变结果。发布接手已更新S21中的仓库、运行记录和真实CI链接；Release与提交SHA以云端回执为准，公开访问以未登录读取回执为准。</w:t>
       </w:r>
     </w:p>
     <w:sectPr>

</xml_diff>

<commit_message>
Synchronize reports with public delivery evidence and PPT notes
</commit_message>
<xml_diff>
--- a/reports/01_AI工程实践主报告.docx
+++ b/reports/01_AI工程实践主报告.docx
@@ -4567,6 +4567,847 @@
     <w:p>
       <w:pPr>
         <w:pStyle w:val="Heading1"/>
+        <w:spacing w:before="360" w:after="320"/>
+      </w:pPr>
+      <w:r>
+        <w:rPr>
+          <w:rFonts w:ascii="Noto Sans CJK SC" w:hAnsi="Noto Sans CJK SC" w:eastAsia="Noto Sans CJK SC" w:cs="Noto Sans CJK SC"/>
+          <w:b w:val="0"/>
+          <w:color w:val="064C91"/>
+          <w:sz w:val="50"/>
+        </w:rPr>
+        <w:t>4.4 发布接手的分层验收</w:t>
+      </w:r>
+    </w:p>
+    <w:p>
+      <w:pPr>
+        <w:spacing w:after="140" w:line="302" w:lineRule="auto"/>
+      </w:pPr>
+      <w:r>
+        <w:rPr>
+          <w:rFonts w:ascii="Noto Serif CJK SC" w:hAnsi="Noto Serif CJK SC" w:eastAsia="Noto Serif CJK SC" w:cs="Noto Serif CJK SC"/>
+          <w:b/>
+          <w:sz w:val="22"/>
+        </w:rPr>
+        <w:t>发布接手的验收对象是教师提交副本，不是重新评价正式模型。下表分别列出资产、运行、界面、检查器、云端与获取证据；各层检查不能相加为“医学验证总数”。</w:t>
+      </w:r>
+    </w:p>
+    <w:tbl>
+      <w:tblPr>
+        <w:tblW w:type="auto" w:w="0"/>
+        <w:jc w:val="center"/>
+        <w:tblLayout w:type="fixed"/>
+        <w:tblLook w:firstColumn="1" w:firstRow="1" w:lastColumn="0" w:lastRow="0" w:noHBand="0" w:noVBand="1" w:val="04A0"/>
+      </w:tblPr>
+      <w:tblGrid>
+        <w:gridCol w:w="1500"/>
+        <w:gridCol w:w="3200"/>
+        <w:gridCol w:w="2200"/>
+        <w:gridCol w:w="2560"/>
+      </w:tblGrid>
+      <w:tr>
+        <w:trPr>
+          <w:cantSplit/>
+          <w:tblHeader/>
+        </w:trPr>
+        <w:tc>
+          <w:tcPr>
+            <w:tcW w:type="dxa" w:w="1500"/>
+            <w:vAlign w:val="center"/>
+            <w:tcMar>
+              <w:top w:w="72" w:type="dxa"/>
+              <w:bottom w:w="72" w:type="dxa"/>
+              <w:left w:w="85" w:type="dxa"/>
+              <w:right w:w="85" w:type="dxa"/>
+            </w:tcMar>
+            <w:shd w:fill="064C91"/>
+          </w:tcPr>
+          <w:p>
+            <w:pPr>
+              <w:spacing w:before="0" w:after="0" w:line="269" w:lineRule="auto"/>
+            </w:pPr>
+            <w:r>
+              <w:rPr>
+                <w:rFonts w:ascii="Noto Sans CJK SC" w:hAnsi="Noto Sans CJK SC" w:eastAsia="Noto Sans CJK SC" w:cs="Noto Sans CJK SC"/>
+                <w:b/>
+                <w:color w:val="FFFFFF"/>
+                <w:sz w:val="20"/>
+              </w:rPr>
+              <w:t>层次</w:t>
+            </w:r>
+          </w:p>
+        </w:tc>
+        <w:tc>
+          <w:tcPr>
+            <w:tcW w:type="dxa" w:w="3200"/>
+            <w:vAlign w:val="center"/>
+            <w:tcMar>
+              <w:top w:w="72" w:type="dxa"/>
+              <w:bottom w:w="72" w:type="dxa"/>
+              <w:left w:w="85" w:type="dxa"/>
+              <w:right w:w="85" w:type="dxa"/>
+            </w:tcMar>
+            <w:shd w:fill="064C91"/>
+          </w:tcPr>
+          <w:p>
+            <w:pPr>
+              <w:spacing w:before="0" w:after="0" w:line="269" w:lineRule="auto"/>
+            </w:pPr>
+            <w:r>
+              <w:rPr>
+                <w:rFonts w:ascii="Noto Sans CJK SC" w:hAnsi="Noto Sans CJK SC" w:eastAsia="Noto Sans CJK SC" w:cs="Noto Sans CJK SC"/>
+                <w:b/>
+                <w:color w:val="FFFFFF"/>
+                <w:sz w:val="20"/>
+              </w:rPr>
+              <w:t>2026年10月19日记录</w:t>
+            </w:r>
+          </w:p>
+        </w:tc>
+        <w:tc>
+          <w:tcPr>
+            <w:tcW w:type="dxa" w:w="2200"/>
+            <w:vAlign w:val="center"/>
+            <w:tcMar>
+              <w:top w:w="72" w:type="dxa"/>
+              <w:bottom w:w="72" w:type="dxa"/>
+              <w:left w:w="85" w:type="dxa"/>
+              <w:right w:w="85" w:type="dxa"/>
+            </w:tcMar>
+            <w:shd w:fill="064C91"/>
+          </w:tcPr>
+          <w:p>
+            <w:pPr>
+              <w:spacing w:before="0" w:after="0" w:line="269" w:lineRule="auto"/>
+            </w:pPr>
+            <w:r>
+              <w:rPr>
+                <w:rFonts w:ascii="Noto Sans CJK SC" w:hAnsi="Noto Sans CJK SC" w:eastAsia="Noto Sans CJK SC" w:cs="Noto Sans CJK SC"/>
+                <w:b/>
+                <w:color w:val="FFFFFF"/>
+                <w:sz w:val="20"/>
+              </w:rPr>
+              <w:t>可以说明</w:t>
+            </w:r>
+          </w:p>
+        </w:tc>
+        <w:tc>
+          <w:tcPr>
+            <w:tcW w:type="dxa" w:w="2560"/>
+            <w:vAlign w:val="center"/>
+            <w:tcMar>
+              <w:top w:w="72" w:type="dxa"/>
+              <w:bottom w:w="72" w:type="dxa"/>
+              <w:left w:w="85" w:type="dxa"/>
+              <w:right w:w="85" w:type="dxa"/>
+            </w:tcMar>
+            <w:shd w:fill="064C91"/>
+          </w:tcPr>
+          <w:p>
+            <w:pPr>
+              <w:spacing w:before="0" w:after="0" w:line="269" w:lineRule="auto"/>
+            </w:pPr>
+            <w:r>
+              <w:rPr>
+                <w:rFonts w:ascii="Noto Sans CJK SC" w:hAnsi="Noto Sans CJK SC" w:eastAsia="Noto Sans CJK SC" w:cs="Noto Sans CJK SC"/>
+                <w:b/>
+                <w:color w:val="FFFFFF"/>
+                <w:sz w:val="20"/>
+              </w:rPr>
+              <w:t>结论边界</w:t>
+            </w:r>
+          </w:p>
+        </w:tc>
+      </w:tr>
+      <w:tr>
+        <w:trPr>
+          <w:cantSplit/>
+        </w:trPr>
+        <w:tc>
+          <w:tcPr>
+            <w:tcW w:type="dxa" w:w="1500"/>
+            <w:vAlign w:val="center"/>
+            <w:tcMar>
+              <w:top w:w="72" w:type="dxa"/>
+              <w:bottom w:w="72" w:type="dxa"/>
+              <w:left w:w="85" w:type="dxa"/>
+              <w:right w:w="85" w:type="dxa"/>
+            </w:tcMar>
+            <w:shd w:fill="EFF4FA"/>
+          </w:tcPr>
+          <w:p>
+            <w:pPr>
+              <w:spacing w:before="0" w:after="0" w:line="269" w:lineRule="auto"/>
+            </w:pPr>
+            <w:r>
+              <w:rPr>
+                <w:rFonts w:ascii="Noto Serif CJK SC" w:hAnsi="Noto Serif CJK SC" w:eastAsia="Noto Serif CJK SC" w:cs="Noto Serif CJK SC"/>
+                <w:b w:val="0"/>
+                <w:sz w:val="20"/>
+              </w:rPr>
+              <w:t>运行资产</w:t>
+            </w:r>
+          </w:p>
+        </w:tc>
+        <w:tc>
+          <w:tcPr>
+            <w:tcW w:type="dxa" w:w="3200"/>
+            <w:vAlign w:val="center"/>
+            <w:tcMar>
+              <w:top w:w="72" w:type="dxa"/>
+              <w:bottom w:w="72" w:type="dxa"/>
+              <w:left w:w="85" w:type="dxa"/>
+              <w:right w:w="85" w:type="dxa"/>
+            </w:tcMar>
+            <w:shd w:fill="EFF4FA"/>
+          </w:tcPr>
+          <w:p>
+            <w:pPr>
+              <w:spacing w:before="0" w:after="0" w:line="269" w:lineRule="auto"/>
+            </w:pPr>
+            <w:r>
+              <w:rPr>
+                <w:rFonts w:ascii="Noto Serif CJK SC" w:hAnsi="Noto Serif CJK SC" w:eastAsia="Noto Serif CJK SC" w:cs="Noto Serif CJK SC"/>
+                <w:b w:val="0"/>
+                <w:sz w:val="20"/>
+              </w:rPr>
+              <w:t>1个FP32 ONNX与10张固定验证PNG，共11份；复制后逐个核对哈希</w:t>
+            </w:r>
+          </w:p>
+        </w:tc>
+        <w:tc>
+          <w:tcPr>
+            <w:tcW w:type="dxa" w:w="2200"/>
+            <w:vAlign w:val="center"/>
+            <w:tcMar>
+              <w:top w:w="72" w:type="dxa"/>
+              <w:bottom w:w="72" w:type="dxa"/>
+              <w:left w:w="85" w:type="dxa"/>
+              <w:right w:w="85" w:type="dxa"/>
+            </w:tcMar>
+            <w:shd w:fill="EFF4FA"/>
+          </w:tcPr>
+          <w:p>
+            <w:pPr>
+              <w:spacing w:before="0" w:after="0" w:line="269" w:lineRule="auto"/>
+            </w:pPr>
+            <w:r>
+              <w:rPr>
+                <w:rFonts w:ascii="Noto Serif CJK SC" w:hAnsi="Noto Serif CJK SC" w:eastAsia="Noto Serif CJK SC" w:cs="Noto Serif CJK SC"/>
+                <w:b w:val="0"/>
+                <w:sz w:val="20"/>
+              </w:rPr>
+              <w:t>基本演示原件已进入新库</w:t>
+            </w:r>
+          </w:p>
+        </w:tc>
+        <w:tc>
+          <w:tcPr>
+            <w:tcW w:type="dxa" w:w="2560"/>
+            <w:vAlign w:val="center"/>
+            <w:tcMar>
+              <w:top w:w="72" w:type="dxa"/>
+              <w:bottom w:w="72" w:type="dxa"/>
+              <w:left w:w="85" w:type="dxa"/>
+              <w:right w:w="85" w:type="dxa"/>
+            </w:tcMar>
+            <w:shd w:fill="EFF4FA"/>
+          </w:tcPr>
+          <w:p>
+            <w:pPr>
+              <w:spacing w:before="0" w:after="0" w:line="269" w:lineRule="auto"/>
+            </w:pPr>
+            <w:r>
+              <w:rPr>
+                <w:rFonts w:ascii="Noto Serif CJK SC" w:hAnsi="Noto Serif CJK SC" w:eastAsia="Noto Serif CJK SC" w:cs="Noto Serif CJK SC"/>
+                <w:b w:val="0"/>
+                <w:sz w:val="20"/>
+              </w:rPr>
+              <w:t>没有重训、重导出或迁移完整数据集</w:t>
+            </w:r>
+          </w:p>
+        </w:tc>
+      </w:tr>
+      <w:tr>
+        <w:trPr>
+          <w:cantSplit/>
+        </w:trPr>
+        <w:tc>
+          <w:tcPr>
+            <w:tcW w:type="dxa" w:w="1500"/>
+            <w:vAlign w:val="center"/>
+            <w:tcMar>
+              <w:top w:w="72" w:type="dxa"/>
+              <w:bottom w:w="72" w:type="dxa"/>
+              <w:left w:w="85" w:type="dxa"/>
+              <w:right w:w="85" w:type="dxa"/>
+            </w:tcMar>
+            <w:shd w:fill="FFFFFF"/>
+          </w:tcPr>
+          <w:p>
+            <w:pPr>
+              <w:spacing w:before="0" w:after="0" w:line="269" w:lineRule="auto"/>
+            </w:pPr>
+            <w:r>
+              <w:rPr>
+                <w:rFonts w:ascii="Noto Serif CJK SC" w:hAnsi="Noto Serif CJK SC" w:eastAsia="Noto Serif CJK SC" w:cs="Noto Serif CJK SC"/>
+                <w:b w:val="0"/>
+                <w:sz w:val="20"/>
+              </w:rPr>
+              <w:t>新副本运行</w:t>
+            </w:r>
+          </w:p>
+        </w:tc>
+        <w:tc>
+          <w:tcPr>
+            <w:tcW w:type="dxa" w:w="3200"/>
+            <w:vAlign w:val="center"/>
+            <w:tcMar>
+              <w:top w:w="72" w:type="dxa"/>
+              <w:bottom w:w="72" w:type="dxa"/>
+              <w:left w:w="85" w:type="dxa"/>
+              <w:right w:w="85" w:type="dxa"/>
+            </w:tcMar>
+            <w:shd w:fill="FFFFFF"/>
+          </w:tcPr>
+          <w:p>
+            <w:pPr>
+              <w:spacing w:before="0" w:after="0" w:line="269" w:lineRule="auto"/>
+            </w:pPr>
+            <w:r>
+              <w:rPr>
+                <w:rFonts w:ascii="Noto Serif CJK SC" w:hAnsi="Noto Serif CJK SC" w:eastAsia="Noto Serif CJK SC" w:cs="Noto Serif CJK SC"/>
+                <w:b w:val="0"/>
+                <w:sz w:val="20"/>
+              </w:rPr>
+              <w:t>独立Mac arm64新目录；20项运行及格式、异常、文件保护检查</w:t>
+            </w:r>
+          </w:p>
+        </w:tc>
+        <w:tc>
+          <w:tcPr>
+            <w:tcW w:type="dxa" w:w="2200"/>
+            <w:vAlign w:val="center"/>
+            <w:tcMar>
+              <w:top w:w="72" w:type="dxa"/>
+              <w:bottom w:w="72" w:type="dxa"/>
+              <w:left w:w="85" w:type="dxa"/>
+              <w:right w:w="85" w:type="dxa"/>
+            </w:tcMar>
+            <w:shd w:fill="FFFFFF"/>
+          </w:tcPr>
+          <w:p>
+            <w:pPr>
+              <w:spacing w:before="0" w:after="0" w:line="269" w:lineRule="auto"/>
+            </w:pPr>
+            <w:r>
+              <w:rPr>
+                <w:rFonts w:ascii="Noto Serif CJK SC" w:hAnsi="Noto Serif CJK SC" w:eastAsia="Noto Serif CJK SC" w:cs="Noto Serif CJK SC"/>
+                <w:b w:val="0"/>
+                <w:sz w:val="20"/>
+              </w:rPr>
+              <w:t>所列环境与输入下行为符合预期</w:t>
+            </w:r>
+          </w:p>
+        </w:tc>
+        <w:tc>
+          <w:tcPr>
+            <w:tcW w:type="dxa" w:w="2560"/>
+            <w:vAlign w:val="center"/>
+            <w:tcMar>
+              <w:top w:w="72" w:type="dxa"/>
+              <w:bottom w:w="72" w:type="dxa"/>
+              <w:left w:w="85" w:type="dxa"/>
+              <w:right w:w="85" w:type="dxa"/>
+            </w:tcMar>
+            <w:shd w:fill="FFFFFF"/>
+          </w:tcPr>
+          <w:p>
+            <w:pPr>
+              <w:spacing w:before="0" w:after="0" w:line="269" w:lineRule="auto"/>
+            </w:pPr>
+            <w:r>
+              <w:rPr>
+                <w:rFonts w:ascii="Noto Serif CJK SC" w:hAnsi="Noto Serif CJK SC" w:eastAsia="Noto Serif CJK SC" w:cs="Noto Serif CJK SC"/>
+                <w:b w:val="0"/>
+                <w:sz w:val="20"/>
+              </w:rPr>
+              <w:t>不是20个病例或新的外部测试成绩</w:t>
+            </w:r>
+          </w:p>
+        </w:tc>
+      </w:tr>
+      <w:tr>
+        <w:trPr>
+          <w:cantSplit/>
+        </w:trPr>
+        <w:tc>
+          <w:tcPr>
+            <w:tcW w:type="dxa" w:w="1500"/>
+            <w:vAlign w:val="center"/>
+            <w:tcMar>
+              <w:top w:w="72" w:type="dxa"/>
+              <w:bottom w:w="72" w:type="dxa"/>
+              <w:left w:w="85" w:type="dxa"/>
+              <w:right w:w="85" w:type="dxa"/>
+            </w:tcMar>
+            <w:shd w:fill="EFF4FA"/>
+          </w:tcPr>
+          <w:p>
+            <w:pPr>
+              <w:spacing w:before="0" w:after="0" w:line="269" w:lineRule="auto"/>
+            </w:pPr>
+            <w:r>
+              <w:rPr>
+                <w:rFonts w:ascii="Noto Serif CJK SC" w:hAnsi="Noto Serif CJK SC" w:eastAsia="Noto Serif CJK SC" w:cs="Noto Serif CJK SC"/>
+                <w:b w:val="0"/>
+                <w:sz w:val="20"/>
+              </w:rPr>
+              <w:t>浏览器用例</w:t>
+            </w:r>
+          </w:p>
+        </w:tc>
+        <w:tc>
+          <w:tcPr>
+            <w:tcW w:type="dxa" w:w="3200"/>
+            <w:vAlign w:val="center"/>
+            <w:tcMar>
+              <w:top w:w="72" w:type="dxa"/>
+              <w:bottom w:w="72" w:type="dxa"/>
+              <w:left w:w="85" w:type="dxa"/>
+              <w:right w:w="85" w:type="dxa"/>
+            </w:tcMar>
+            <w:shd w:fill="EFF4FA"/>
+          </w:tcPr>
+          <w:p>
+            <w:pPr>
+              <w:spacing w:before="0" w:after="0" w:line="269" w:lineRule="auto"/>
+            </w:pPr>
+            <w:r>
+              <w:rPr>
+                <w:rFonts w:ascii="Noto Serif CJK SC" w:hAnsi="Noto Serif CJK SC" w:eastAsia="Noto Serif CJK SC" w:cs="Noto Serif CJK SC"/>
+                <w:b w:val="0"/>
+                <w:sz w:val="20"/>
+              </w:rPr>
+              <w:t>4项：正确、不一致、有效上传、损坏上传；3次真实验证样例前向</w:t>
+            </w:r>
+          </w:p>
+        </w:tc>
+        <w:tc>
+          <w:tcPr>
+            <w:tcW w:type="dxa" w:w="2200"/>
+            <w:vAlign w:val="center"/>
+            <w:tcMar>
+              <w:top w:w="72" w:type="dxa"/>
+              <w:bottom w:w="72" w:type="dxa"/>
+              <w:left w:w="85" w:type="dxa"/>
+              <w:right w:w="85" w:type="dxa"/>
+            </w:tcMar>
+            <w:shd w:fill="EFF4FA"/>
+          </w:tcPr>
+          <w:p>
+            <w:pPr>
+              <w:spacing w:before="0" w:after="0" w:line="269" w:lineRule="auto"/>
+            </w:pPr>
+            <w:r>
+              <w:rPr>
+                <w:rFonts w:ascii="Noto Serif CJK SC" w:hAnsi="Noto Serif CJK SC" w:eastAsia="Noto Serif CJK SC" w:cs="Noto Serif CJK SC"/>
+                <w:b w:val="0"/>
+                <w:sz w:val="20"/>
+              </w:rPr>
+              <w:t>所列页面流程可执行</w:t>
+            </w:r>
+          </w:p>
+        </w:tc>
+        <w:tc>
+          <w:tcPr>
+            <w:tcW w:type="dxa" w:w="2560"/>
+            <w:vAlign w:val="center"/>
+            <w:tcMar>
+              <w:top w:w="72" w:type="dxa"/>
+              <w:bottom w:w="72" w:type="dxa"/>
+              <w:left w:w="85" w:type="dxa"/>
+              <w:right w:w="85" w:type="dxa"/>
+            </w:tcMar>
+            <w:shd w:fill="EFF4FA"/>
+          </w:tcPr>
+          <w:p>
+            <w:pPr>
+              <w:spacing w:before="0" w:after="0" w:line="269" w:lineRule="auto"/>
+            </w:pPr>
+            <w:r>
+              <w:rPr>
+                <w:rFonts w:ascii="Noto Serif CJK SC" w:hAnsi="Noto Serif CJK SC" w:eastAsia="Noto Serif CJK SC" w:cs="Noto Serif CJK SC"/>
+                <w:b w:val="0"/>
+                <w:sz w:val="20"/>
+              </w:rPr>
+              <w:t>不是4个新测试集，也不是浏览器全局断网</w:t>
+            </w:r>
+          </w:p>
+        </w:tc>
+      </w:tr>
+      <w:tr>
+        <w:trPr>
+          <w:cantSplit/>
+        </w:trPr>
+        <w:tc>
+          <w:tcPr>
+            <w:tcW w:type="dxa" w:w="1500"/>
+            <w:vAlign w:val="center"/>
+            <w:tcMar>
+              <w:top w:w="72" w:type="dxa"/>
+              <w:bottom w:w="72" w:type="dxa"/>
+              <w:left w:w="85" w:type="dxa"/>
+              <w:right w:w="85" w:type="dxa"/>
+            </w:tcMar>
+            <w:shd w:fill="EFF4FA"/>
+          </w:tcPr>
+          <w:p>
+            <w:pPr>
+              <w:spacing w:before="0" w:after="0" w:line="269" w:lineRule="auto"/>
+            </w:pPr>
+            <w:r>
+              <w:rPr>
+                <w:rFonts w:ascii="Noto Serif CJK SC" w:hAnsi="Noto Serif CJK SC" w:eastAsia="Noto Serif CJK SC" w:cs="Noto Serif CJK SC"/>
+                <w:b w:val="0"/>
+                <w:sz w:val="20"/>
+              </w:rPr>
+              <w:t>检查器测试</w:t>
+            </w:r>
+          </w:p>
+        </w:tc>
+        <w:tc>
+          <w:tcPr>
+            <w:tcW w:type="dxa" w:w="3200"/>
+            <w:vAlign w:val="center"/>
+            <w:tcMar>
+              <w:top w:w="72" w:type="dxa"/>
+              <w:bottom w:w="72" w:type="dxa"/>
+              <w:left w:w="85" w:type="dxa"/>
+              <w:right w:w="85" w:type="dxa"/>
+            </w:tcMar>
+            <w:shd w:fill="EFF4FA"/>
+          </w:tcPr>
+          <w:p>
+            <w:pPr>
+              <w:spacing w:before="0" w:after="0" w:line="269" w:lineRule="auto"/>
+            </w:pPr>
+            <w:r>
+              <w:rPr>
+                <w:rFonts w:ascii="Noto Serif CJK SC" w:hAnsi="Noto Serif CJK SC" w:eastAsia="Noto Serif CJK SC" w:cs="Noto Serif CJK SC"/>
+                <w:b w:val="0"/>
+                <w:sz w:val="20"/>
+              </w:rPr>
+              <w:t>21项合成及边界单元测试</w:t>
+            </w:r>
+          </w:p>
+        </w:tc>
+        <w:tc>
+          <w:tcPr>
+            <w:tcW w:type="dxa" w:w="2200"/>
+            <w:vAlign w:val="center"/>
+            <w:tcMar>
+              <w:top w:w="72" w:type="dxa"/>
+              <w:bottom w:w="72" w:type="dxa"/>
+              <w:left w:w="85" w:type="dxa"/>
+              <w:right w:w="85" w:type="dxa"/>
+            </w:tcMar>
+            <w:shd w:fill="EFF4FA"/>
+          </w:tcPr>
+          <w:p>
+            <w:pPr>
+              <w:spacing w:before="0" w:after="0" w:line="269" w:lineRule="auto"/>
+            </w:pPr>
+            <w:r>
+              <w:rPr>
+                <w:rFonts w:ascii="Noto Serif CJK SC" w:hAnsi="Noto Serif CJK SC" w:eastAsia="Noto Serif CJK SC" w:cs="Noto Serif CJK SC"/>
+                <w:b w:val="0"/>
+                <w:sz w:val="20"/>
+              </w:rPr>
+              <w:t>提交检查器的所列行为通过</w:t>
+            </w:r>
+          </w:p>
+        </w:tc>
+        <w:tc>
+          <w:tcPr>
+            <w:tcW w:type="dxa" w:w="2560"/>
+            <w:vAlign w:val="center"/>
+            <w:tcMar>
+              <w:top w:w="72" w:type="dxa"/>
+              <w:bottom w:w="72" w:type="dxa"/>
+              <w:left w:w="85" w:type="dxa"/>
+              <w:right w:w="85" w:type="dxa"/>
+            </w:tcMar>
+            <w:shd w:fill="EFF4FA"/>
+          </w:tcPr>
+          <w:p>
+            <w:pPr>
+              <w:spacing w:before="0" w:after="0" w:line="269" w:lineRule="auto"/>
+            </w:pPr>
+            <w:r>
+              <w:rPr>
+                <w:rFonts w:ascii="Noto Serif CJK SC" w:hAnsi="Noto Serif CJK SC" w:eastAsia="Noto Serif CJK SC" w:cs="Noto Serif CJK SC"/>
+                <w:b w:val="0"/>
+                <w:sz w:val="20"/>
+              </w:rPr>
+              <w:t>不是分类网络的新实验成绩</w:t>
+            </w:r>
+          </w:p>
+        </w:tc>
+      </w:tr>
+      <w:tr>
+        <w:trPr>
+          <w:cantSplit/>
+        </w:trPr>
+        <w:tc>
+          <w:tcPr>
+            <w:tcW w:type="dxa" w:w="1500"/>
+            <w:vAlign w:val="center"/>
+            <w:tcMar>
+              <w:top w:w="72" w:type="dxa"/>
+              <w:bottom w:w="72" w:type="dxa"/>
+              <w:left w:w="85" w:type="dxa"/>
+              <w:right w:w="85" w:type="dxa"/>
+            </w:tcMar>
+            <w:shd w:fill="FFFFFF"/>
+          </w:tcPr>
+          <w:p>
+            <w:pPr>
+              <w:spacing w:before="0" w:after="0" w:line="269" w:lineRule="auto"/>
+            </w:pPr>
+            <w:r>
+              <w:rPr>
+                <w:rFonts w:ascii="Noto Serif CJK SC" w:hAnsi="Noto Serif CJK SC" w:eastAsia="Noto Serif CJK SC" w:cs="Noto Serif CJK SC"/>
+                <w:b w:val="0"/>
+                <w:sz w:val="20"/>
+              </w:rPr>
+              <w:t>GitHub Actions</w:t>
+            </w:r>
+          </w:p>
+        </w:tc>
+        <w:tc>
+          <w:tcPr>
+            <w:tcW w:type="dxa" w:w="3200"/>
+            <w:vAlign w:val="center"/>
+            <w:tcMar>
+              <w:top w:w="72" w:type="dxa"/>
+              <w:bottom w:w="72" w:type="dxa"/>
+              <w:left w:w="85" w:type="dxa"/>
+              <w:right w:w="85" w:type="dxa"/>
+            </w:tcMar>
+            <w:shd w:fill="FFFFFF"/>
+          </w:tcPr>
+          <w:p>
+            <w:pPr>
+              <w:spacing w:before="0" w:after="0" w:line="269" w:lineRule="auto"/>
+            </w:pPr>
+            <w:r>
+              <w:rPr>
+                <w:rFonts w:ascii="Noto Serif CJK SC" w:hAnsi="Noto Serif CJK SC" w:eastAsia="Noto Serif CJK SC" w:cs="Noto Serif CJK SC"/>
+                <w:b w:val="0"/>
+                <w:sz w:val="20"/>
+              </w:rPr>
+              <w:t>运行检查器测试及严格文件、保存结果算术检查</w:t>
+            </w:r>
+          </w:p>
+        </w:tc>
+        <w:tc>
+          <w:tcPr>
+            <w:tcW w:type="dxa" w:w="2200"/>
+            <w:vAlign w:val="center"/>
+            <w:tcMar>
+              <w:top w:w="72" w:type="dxa"/>
+              <w:bottom w:w="72" w:type="dxa"/>
+              <w:left w:w="85" w:type="dxa"/>
+              <w:right w:w="85" w:type="dxa"/>
+            </w:tcMar>
+            <w:shd w:fill="FFFFFF"/>
+          </w:tcPr>
+          <w:p>
+            <w:pPr>
+              <w:spacing w:before="0" w:after="0" w:line="269" w:lineRule="auto"/>
+            </w:pPr>
+            <w:r>
+              <w:rPr>
+                <w:rFonts w:ascii="Noto Serif CJK SC" w:hAnsi="Noto Serif CJK SC" w:eastAsia="Noto Serif CJK SC" w:cs="Noto Serif CJK SC"/>
+                <w:b w:val="0"/>
+                <w:sz w:val="20"/>
+              </w:rPr>
+              <w:t>指定提交的云端质量门通过</w:t>
+            </w:r>
+          </w:p>
+        </w:tc>
+        <w:tc>
+          <w:tcPr>
+            <w:tcW w:type="dxa" w:w="2560"/>
+            <w:vAlign w:val="center"/>
+            <w:tcMar>
+              <w:top w:w="72" w:type="dxa"/>
+              <w:bottom w:w="72" w:type="dxa"/>
+              <w:left w:w="85" w:type="dxa"/>
+              <w:right w:w="85" w:type="dxa"/>
+            </w:tcMar>
+            <w:shd w:fill="FFFFFF"/>
+          </w:tcPr>
+          <w:p>
+            <w:pPr>
+              <w:spacing w:before="0" w:after="0" w:line="269" w:lineRule="auto"/>
+            </w:pPr>
+            <w:r>
+              <w:rPr>
+                <w:rFonts w:ascii="Noto Serif CJK SC" w:hAnsi="Noto Serif CJK SC" w:eastAsia="Noto Serif CJK SC" w:cs="Noto Serif CJK SC"/>
+                <w:b w:val="0"/>
+                <w:sz w:val="20"/>
+              </w:rPr>
+              <w:t>没有在云端训练、加载模型或建立推理服务</w:t>
+            </w:r>
+          </w:p>
+        </w:tc>
+      </w:tr>
+      <w:tr>
+        <w:trPr>
+          <w:cantSplit/>
+        </w:trPr>
+        <w:tc>
+          <w:tcPr>
+            <w:tcW w:type="dxa" w:w="1500"/>
+            <w:vAlign w:val="center"/>
+            <w:tcMar>
+              <w:top w:w="72" w:type="dxa"/>
+              <w:bottom w:w="72" w:type="dxa"/>
+              <w:left w:w="85" w:type="dxa"/>
+              <w:right w:w="85" w:type="dxa"/>
+            </w:tcMar>
+            <w:shd w:fill="EFF4FA"/>
+          </w:tcPr>
+          <w:p>
+            <w:pPr>
+              <w:spacing w:before="0" w:after="0" w:line="269" w:lineRule="auto"/>
+            </w:pPr>
+            <w:r>
+              <w:rPr>
+                <w:rFonts w:ascii="Noto Serif CJK SC" w:hAnsi="Noto Serif CJK SC" w:eastAsia="Noto Serif CJK SC" w:cs="Noto Serif CJK SC"/>
+                <w:b w:val="0"/>
+                <w:sz w:val="20"/>
+              </w:rPr>
+              <w:t>对外获取</w:t>
+            </w:r>
+          </w:p>
+        </w:tc>
+        <w:tc>
+          <w:tcPr>
+            <w:tcW w:type="dxa" w:w="3200"/>
+            <w:vAlign w:val="center"/>
+            <w:tcMar>
+              <w:top w:w="72" w:type="dxa"/>
+              <w:bottom w:w="72" w:type="dxa"/>
+              <w:left w:w="85" w:type="dxa"/>
+              <w:right w:w="85" w:type="dxa"/>
+            </w:tcMar>
+            <w:shd w:fill="EFF4FA"/>
+          </w:tcPr>
+          <w:p>
+            <w:pPr>
+              <w:spacing w:before="0" w:after="0" w:line="269" w:lineRule="auto"/>
+            </w:pPr>
+            <w:r>
+              <w:rPr>
+                <w:rFonts w:ascii="Noto Serif CJK SC" w:hAnsi="Noto Serif CJK SC" w:eastAsia="Noto Serif CJK SC" w:cs="Noto Serif CJK SC"/>
+                <w:b w:val="0"/>
+                <w:sz w:val="20"/>
+              </w:rPr>
+              <w:t>公开库及Release；匿名下载后核对附件哈希</w:t>
+            </w:r>
+          </w:p>
+        </w:tc>
+        <w:tc>
+          <w:tcPr>
+            <w:tcW w:type="dxa" w:w="2200"/>
+            <w:vAlign w:val="center"/>
+            <w:tcMar>
+              <w:top w:w="72" w:type="dxa"/>
+              <w:bottom w:w="72" w:type="dxa"/>
+              <w:left w:w="85" w:type="dxa"/>
+              <w:right w:w="85" w:type="dxa"/>
+            </w:tcMar>
+            <w:shd w:fill="EFF4FA"/>
+          </w:tcPr>
+          <w:p>
+            <w:pPr>
+              <w:spacing w:before="0" w:after="0" w:line="269" w:lineRule="auto"/>
+            </w:pPr>
+            <w:r>
+              <w:rPr>
+                <w:rFonts w:ascii="Noto Serif CJK SC" w:hAnsi="Noto Serif CJK SC" w:eastAsia="Noto Serif CJK SC" w:cs="Noto Serif CJK SC"/>
+                <w:b w:val="0"/>
+                <w:sz w:val="20"/>
+              </w:rPr>
+              <w:t>外部读者无需原私有库权限获取材料</w:t>
+            </w:r>
+          </w:p>
+        </w:tc>
+        <w:tc>
+          <w:tcPr>
+            <w:tcW w:type="dxa" w:w="2560"/>
+            <w:vAlign w:val="center"/>
+            <w:tcMar>
+              <w:top w:w="72" w:type="dxa"/>
+              <w:bottom w:w="72" w:type="dxa"/>
+              <w:left w:w="85" w:type="dxa"/>
+              <w:right w:w="85" w:type="dxa"/>
+            </w:tcMar>
+            <w:shd w:fill="EFF4FA"/>
+          </w:tcPr>
+          <w:p>
+            <w:pPr>
+              <w:spacing w:before="0" w:after="0" w:line="269" w:lineRule="auto"/>
+            </w:pPr>
+            <w:r>
+              <w:rPr>
+                <w:rFonts w:ascii="Noto Serif CJK SC" w:hAnsi="Noto Serif CJK SC" w:eastAsia="Noto Serif CJK SC" w:cs="Noto Serif CJK SC"/>
+                <w:b w:val="0"/>
+                <w:sz w:val="20"/>
+              </w:rPr>
+              <w:t>不证明临床使用或独立复现实验</w:t>
+            </w:r>
+          </w:p>
+        </w:tc>
+      </w:tr>
+    </w:tbl>
+    <w:p>
+      <w:pPr>
+        <w:spacing w:after="140" w:line="302" w:lineRule="auto"/>
+      </w:pPr>
+      <w:r>
+        <w:rPr>
+          <w:rFonts w:ascii="Noto Serif CJK SC" w:hAnsi="Noto Serif CJK SC" w:eastAsia="Noto Serif CJK SC" w:cs="Noto Serif CJK SC"/>
+          <w:b/>
+          <w:sz w:val="22"/>
+        </w:rPr>
+        <w:t>命令行运行验收由操作系统限制外网。浏览器用例中，应用仅允许本机回环访问，浏览器本身未全局断网。依赖安装与断网运行也属于不同环节。[S21–S22]</w:t>
+      </w:r>
+    </w:p>
+    <w:p>
+      <w:pPr>
+        <w:spacing w:after="140" w:line="302" w:lineRule="auto"/>
+      </w:pPr>
+      <w:r>
+        <w:rPr>
+          <w:rFonts w:ascii="Noto Serif CJK SC" w:hAnsi="Noto Serif CJK SC" w:eastAsia="Noto Serif CJK SC" w:cs="Noto Serif CJK SC"/>
+          <w:b/>
+          <w:sz w:val="22"/>
+        </w:rPr>
+        <w:t>依据为运行资产复制表、新副本运行JSON、浏览器回执与云端记录。2026年10月19日的真实CI以指定提交和运行链接为准；本次文稿同步不重新执行模型验收。[S21–S22]</w:t>
+      </w:r>
+    </w:p>
+    <w:p>
+      <w:r>
+        <w:br w:type="page"/>
+      </w:r>
+    </w:p>
+    <w:p>
+      <w:pPr>
+        <w:pStyle w:val="Heading1"/>
       </w:pPr>
       <w:r>
         <w:rPr>
@@ -7390,6 +8231,378 @@
     <w:p>
       <w:pPr>
         <w:pStyle w:val="Heading1"/>
+        <w:spacing w:before="360" w:after="320"/>
+      </w:pPr>
+      <w:r>
+        <w:rPr>
+          <w:rFonts w:ascii="Noto Sans CJK SC" w:hAnsi="Noto Sans CJK SC" w:eastAsia="Noto Sans CJK SC" w:cs="Noto Sans CJK SC"/>
+          <w:b w:val="0"/>
+          <w:color w:val="064C91"/>
+          <w:sz w:val="50"/>
+        </w:rPr>
+        <w:t>7.4 从ChatGPT交接包到公开GitHub交付</w:t>
+      </w:r>
+    </w:p>
+    <w:p>
+      <w:pPr>
+        <w:spacing w:after="140" w:line="302" w:lineRule="auto"/>
+      </w:pPr>
+      <w:r>
+        <w:rPr>
+          <w:rFonts w:ascii="Noto Serif CJK SC" w:hAnsi="Noto Serif CJK SC" w:eastAsia="Noto Serif CJK SC" w:cs="Noto Serif CJK SC"/>
+          <w:b w:val="0"/>
+          <w:sz w:val="22"/>
+        </w:rPr>
+        <w:t>2026年10月19日，项目从文稿整理转入发布接手。ChatGPT会话已形成主报告、附件、PPT、检查器和交接任务包；用户将材料交给已有Codex会话，在获授权工作区继续执行。本次没有由ChatGPT自动创建新的Codex对话或自动派发任务。[S20–S22]</w:t>
+      </w:r>
+    </w:p>
+    <w:tbl>
+      <w:tblPr>
+        <w:tblW w:type="auto" w:w="0"/>
+        <w:jc w:val="center"/>
+        <w:tblLayout w:type="fixed"/>
+        <w:tblLook w:firstColumn="1" w:firstRow="1" w:lastColumn="0" w:lastRow="0" w:noHBand="0" w:noVBand="1" w:val="04A0"/>
+      </w:tblPr>
+      <w:tblGrid>
+        <w:gridCol w:w="2000"/>
+        <w:gridCol w:w="7460"/>
+      </w:tblGrid>
+      <w:tr>
+        <w:trPr>
+          <w:cantSplit/>
+          <w:tblHeader/>
+        </w:trPr>
+        <w:tc>
+          <w:tcPr>
+            <w:tcW w:type="dxa" w:w="2000"/>
+            <w:vAlign w:val="center"/>
+            <w:tcMar>
+              <w:top w:w="72" w:type="dxa"/>
+              <w:bottom w:w="72" w:type="dxa"/>
+              <w:left w:w="85" w:type="dxa"/>
+              <w:right w:w="85" w:type="dxa"/>
+            </w:tcMar>
+            <w:shd w:fill="064C91"/>
+          </w:tcPr>
+          <w:p>
+            <w:pPr>
+              <w:spacing w:before="0" w:after="0" w:line="269" w:lineRule="auto"/>
+            </w:pPr>
+            <w:r>
+              <w:rPr>
+                <w:rFonts w:ascii="Noto Sans CJK SC" w:hAnsi="Noto Sans CJK SC" w:eastAsia="Noto Sans CJK SC" w:cs="Noto Sans CJK SC"/>
+                <w:b/>
+                <w:color w:val="FFFFFF"/>
+                <w:sz w:val="20"/>
+              </w:rPr>
+              <w:t>环节</w:t>
+            </w:r>
+          </w:p>
+        </w:tc>
+        <w:tc>
+          <w:tcPr>
+            <w:tcW w:type="dxa" w:w="7460"/>
+            <w:vAlign w:val="center"/>
+            <w:tcMar>
+              <w:top w:w="72" w:type="dxa"/>
+              <w:bottom w:w="72" w:type="dxa"/>
+              <w:left w:w="85" w:type="dxa"/>
+              <w:right w:w="85" w:type="dxa"/>
+            </w:tcMar>
+            <w:shd w:fill="064C91"/>
+          </w:tcPr>
+          <w:p>
+            <w:pPr>
+              <w:spacing w:before="0" w:after="0" w:line="269" w:lineRule="auto"/>
+            </w:pPr>
+            <w:r>
+              <w:rPr>
+                <w:rFonts w:ascii="Noto Sans CJK SC" w:hAnsi="Noto Sans CJK SC" w:eastAsia="Noto Sans CJK SC" w:cs="Noto Sans CJK SC"/>
+                <w:b/>
+                <w:color w:val="FFFFFF"/>
+                <w:sz w:val="20"/>
+              </w:rPr>
+              <w:t>实际衔接</w:t>
+            </w:r>
+          </w:p>
+        </w:tc>
+      </w:tr>
+      <w:tr>
+        <w:trPr>
+          <w:cantSplit/>
+        </w:trPr>
+        <w:tc>
+          <w:tcPr>
+            <w:tcW w:type="dxa" w:w="2000"/>
+            <w:vAlign w:val="center"/>
+            <w:tcMar>
+              <w:top w:w="72" w:type="dxa"/>
+              <w:bottom w:w="72" w:type="dxa"/>
+              <w:left w:w="85" w:type="dxa"/>
+              <w:right w:w="85" w:type="dxa"/>
+            </w:tcMar>
+            <w:shd w:fill="EFF4FA"/>
+          </w:tcPr>
+          <w:p>
+            <w:pPr>
+              <w:spacing w:before="0" w:after="0" w:line="269" w:lineRule="auto"/>
+            </w:pPr>
+            <w:r>
+              <w:rPr>
+                <w:rFonts w:ascii="Noto Serif CJK SC" w:hAnsi="Noto Serif CJK SC" w:eastAsia="Noto Serif CJK SC" w:cs="Noto Serif CJK SC"/>
+                <w:b w:val="0"/>
+                <w:sz w:val="20"/>
+              </w:rPr>
+              <w:t>交接</w:t>
+            </w:r>
+          </w:p>
+        </w:tc>
+        <w:tc>
+          <w:tcPr>
+            <w:tcW w:type="dxa" w:w="7460"/>
+            <w:vAlign w:val="center"/>
+            <w:tcMar>
+              <w:top w:w="72" w:type="dxa"/>
+              <w:bottom w:w="72" w:type="dxa"/>
+              <w:left w:w="85" w:type="dxa"/>
+              <w:right w:w="85" w:type="dxa"/>
+            </w:tcMar>
+            <w:shd w:fill="EFF4FA"/>
+          </w:tcPr>
+          <w:p>
+            <w:pPr>
+              <w:spacing w:before="0" w:after="0" w:line="269" w:lineRule="auto"/>
+            </w:pPr>
+            <w:r>
+              <w:rPr>
+                <w:rFonts w:ascii="Noto Serif CJK SC" w:hAnsi="Noto Serif CJK SC" w:eastAsia="Noto Serif CJK SC" w:cs="Noto Serif CJK SC"/>
+                <w:b w:val="0"/>
+                <w:sz w:val="20"/>
+              </w:rPr>
+              <w:t>ChatGPT整理报告、PPT、检查器和执行清单，用户交给已有Codex会话</w:t>
+            </w:r>
+          </w:p>
+        </w:tc>
+      </w:tr>
+      <w:tr>
+        <w:trPr>
+          <w:cantSplit/>
+        </w:trPr>
+        <w:tc>
+          <w:tcPr>
+            <w:tcW w:type="dxa" w:w="2000"/>
+            <w:vAlign w:val="center"/>
+            <w:tcMar>
+              <w:top w:w="72" w:type="dxa"/>
+              <w:bottom w:w="72" w:type="dxa"/>
+              <w:left w:w="85" w:type="dxa"/>
+              <w:right w:w="85" w:type="dxa"/>
+            </w:tcMar>
+            <w:shd w:fill="FFFFFF"/>
+          </w:tcPr>
+          <w:p>
+            <w:pPr>
+              <w:spacing w:before="0" w:after="0" w:line="269" w:lineRule="auto"/>
+            </w:pPr>
+            <w:r>
+              <w:rPr>
+                <w:rFonts w:ascii="Noto Serif CJK SC" w:hAnsi="Noto Serif CJK SC" w:eastAsia="Noto Serif CJK SC" w:cs="Noto Serif CJK SC"/>
+                <w:b w:val="0"/>
+                <w:sz w:val="20"/>
+              </w:rPr>
+              <w:t>核对与复制</w:t>
+            </w:r>
+          </w:p>
+        </w:tc>
+        <w:tc>
+          <w:tcPr>
+            <w:tcW w:type="dxa" w:w="7460"/>
+            <w:vAlign w:val="center"/>
+            <w:tcMar>
+              <w:top w:w="72" w:type="dxa"/>
+              <w:bottom w:w="72" w:type="dxa"/>
+              <w:left w:w="85" w:type="dxa"/>
+              <w:right w:w="85" w:type="dxa"/>
+            </w:tcMar>
+            <w:shd w:fill="FFFFFF"/>
+          </w:tcPr>
+          <w:p>
+            <w:pPr>
+              <w:spacing w:before="0" w:after="0" w:line="269" w:lineRule="auto"/>
+            </w:pPr>
+            <w:r>
+              <w:rPr>
+                <w:rFonts w:ascii="Noto Serif CJK SC" w:hAnsi="Noto Serif CJK SC" w:eastAsia="Noto Serif CJK SC" w:cs="Noto Serif CJK SC"/>
+                <w:b w:val="0"/>
+                <w:sz w:val="20"/>
+              </w:rPr>
+              <w:t>保护原仓库，核对当前文件，仅复制原模型与固定验证样例</w:t>
+            </w:r>
+          </w:p>
+        </w:tc>
+      </w:tr>
+      <w:tr>
+        <w:trPr>
+          <w:cantSplit/>
+        </w:trPr>
+        <w:tc>
+          <w:tcPr>
+            <w:tcW w:type="dxa" w:w="2000"/>
+            <w:vAlign w:val="center"/>
+            <w:tcMar>
+              <w:top w:w="72" w:type="dxa"/>
+              <w:bottom w:w="72" w:type="dxa"/>
+              <w:left w:w="85" w:type="dxa"/>
+              <w:right w:w="85" w:type="dxa"/>
+            </w:tcMar>
+            <w:shd w:fill="EFF4FA"/>
+          </w:tcPr>
+          <w:p>
+            <w:pPr>
+              <w:spacing w:before="0" w:after="0" w:line="269" w:lineRule="auto"/>
+            </w:pPr>
+            <w:r>
+              <w:rPr>
+                <w:rFonts w:ascii="Noto Serif CJK SC" w:hAnsi="Noto Serif CJK SC" w:eastAsia="Noto Serif CJK SC" w:cs="Noto Serif CJK SC"/>
+                <w:b w:val="0"/>
+                <w:sz w:val="20"/>
+              </w:rPr>
+              <w:t>新副本验收</w:t>
+            </w:r>
+          </w:p>
+        </w:tc>
+        <w:tc>
+          <w:tcPr>
+            <w:tcW w:type="dxa" w:w="7460"/>
+            <w:vAlign w:val="center"/>
+            <w:tcMar>
+              <w:top w:w="72" w:type="dxa"/>
+              <w:bottom w:w="72" w:type="dxa"/>
+              <w:left w:w="85" w:type="dxa"/>
+              <w:right w:w="85" w:type="dxa"/>
+            </w:tcMar>
+            <w:shd w:fill="EFF4FA"/>
+          </w:tcPr>
+          <w:p>
+            <w:pPr>
+              <w:spacing w:before="0" w:after="0" w:line="269" w:lineRule="auto"/>
+            </w:pPr>
+            <w:r>
+              <w:rPr>
+                <w:rFonts w:ascii="Noto Serif CJK SC" w:hAnsi="Noto Serif CJK SC" w:eastAsia="Noto Serif CJK SC" w:cs="Noto Serif CJK SC"/>
+                <w:b w:val="0"/>
+                <w:sz w:val="20"/>
+              </w:rPr>
+              <w:t>独立环境及新目录检查参考输出、异常输入与文件保护</w:t>
+            </w:r>
+          </w:p>
+        </w:tc>
+      </w:tr>
+      <w:tr>
+        <w:trPr>
+          <w:cantSplit/>
+        </w:trPr>
+        <w:tc>
+          <w:tcPr>
+            <w:tcW w:type="dxa" w:w="2000"/>
+            <w:vAlign w:val="center"/>
+            <w:tcMar>
+              <w:top w:w="72" w:type="dxa"/>
+              <w:bottom w:w="72" w:type="dxa"/>
+              <w:left w:w="85" w:type="dxa"/>
+              <w:right w:w="85" w:type="dxa"/>
+            </w:tcMar>
+            <w:shd w:fill="FFFFFF"/>
+          </w:tcPr>
+          <w:p>
+            <w:pPr>
+              <w:spacing w:before="0" w:after="0" w:line="269" w:lineRule="auto"/>
+            </w:pPr>
+            <w:r>
+              <w:rPr>
+                <w:rFonts w:ascii="Noto Serif CJK SC" w:hAnsi="Noto Serif CJK SC" w:eastAsia="Noto Serif CJK SC" w:cs="Noto Serif CJK SC"/>
+                <w:b w:val="0"/>
+                <w:sz w:val="20"/>
+              </w:rPr>
+              <w:t>云端与获取</w:t>
+            </w:r>
+          </w:p>
+        </w:tc>
+        <w:tc>
+          <w:tcPr>
+            <w:tcW w:type="dxa" w:w="7460"/>
+            <w:vAlign w:val="center"/>
+            <w:tcMar>
+              <w:top w:w="72" w:type="dxa"/>
+              <w:bottom w:w="72" w:type="dxa"/>
+              <w:left w:w="85" w:type="dxa"/>
+              <w:right w:w="85" w:type="dxa"/>
+            </w:tcMar>
+            <w:shd w:fill="FFFFFF"/>
+          </w:tcPr>
+          <w:p>
+            <w:pPr>
+              <w:spacing w:before="0" w:after="0" w:line="269" w:lineRule="auto"/>
+            </w:pPr>
+            <w:r>
+              <w:rPr>
+                <w:rFonts w:ascii="Noto Serif CJK SC" w:hAnsi="Noto Serif CJK SC" w:eastAsia="Noto Serif CJK SC" w:cs="Noto Serif CJK SC"/>
+                <w:b w:val="0"/>
+                <w:sz w:val="20"/>
+              </w:rPr>
+              <w:t>指定提交运行CI，公开发布附件，再匿名下载核对哈希</w:t>
+            </w:r>
+          </w:p>
+        </w:tc>
+      </w:tr>
+    </w:tbl>
+    <w:p>
+      <w:pPr>
+        <w:spacing w:after="140" w:line="302" w:lineRule="auto"/>
+      </w:pPr>
+      <w:r>
+        <w:rPr>
+          <w:rFonts w:ascii="Noto Serif CJK SC" w:hAnsi="Noto Serif CJK SC" w:eastAsia="Noto Serif CJK SC" w:cs="Noto Serif CJK SC"/>
+          <w:b w:val="0"/>
+          <w:sz w:val="22"/>
+        </w:rPr>
+        <w:t>Codex先核对当前目录、原仓库版本及文件哈希，再从既有归档复制FP32 ONNX与10张固定验证样例。原科学仓库保持保护，新教师仓库承接阅读和交付；不能用旧ZIP覆盖已有的新修改，也不把资产复制写成模型重训。</w:t>
+      </w:r>
+    </w:p>
+    <w:p>
+      <w:pPr>
+        <w:spacing w:after="140" w:line="302" w:lineRule="auto"/>
+      </w:pPr>
+      <w:r>
+        <w:rPr>
+          <w:rFonts w:ascii="Noto Serif CJK SC" w:hAnsi="Noto Serif CJK SC" w:eastAsia="Noto Serif CJK SC" w:cs="Noto Serif CJK SC"/>
+          <w:b w:val="0"/>
+          <w:sz w:val="22"/>
+        </w:rPr>
+        <w:t>随后在独立Mac环境和新目录验收固定样例与异常行为，并推送教师仓库运行云端文件和保存结果算术检查。仓库初建为私有，后按小组决定公开；v1.1.0-teacher保留了完整材料包、独立演示包与校验值，发布回执记录材料提交、CI及匿名下载核对。[S21–S22]</w:t>
+      </w:r>
+    </w:p>
+    <w:p>
+      <w:pPr>
+        <w:spacing w:after="140" w:line="302" w:lineRule="auto"/>
+      </w:pPr>
+      <w:r>
+        <w:rPr>
+          <w:rFonts w:ascii="Noto Serif CJK SC" w:hAnsi="Noto Serif CJK SC" w:eastAsia="Noto Serif CJK SC" w:cs="Noto Serif CJK SC"/>
+          <w:b w:val="0"/>
+          <w:sz w:val="22"/>
+        </w:rPr>
+        <w:t>新副本检查回答“搬迁后程序能否保持参考行为”，CI回答“提交文件及保存结果是否符合检查条件”，匿名下载回答“外部读者能否取得同版材料”。本轮v1.2.0-teacher只同步文稿与发布过程，不重训或重开官方测试。各层证据共同支持交付，不构成新增临床验证。</w:t>
+      </w:r>
+    </w:p>
+    <w:p>
+      <w:r>
+        <w:br w:type="page"/>
+      </w:r>
+    </w:p>
+    <w:p>
+      <w:pPr>
+        <w:pStyle w:val="Heading1"/>
       </w:pPr>
       <w:r>
         <w:rPr>
@@ -7911,6 +9124,179 @@
     </w:p>
     <w:p>
       <w:pPr>
+        <w:spacing w:after="140" w:line="302" w:lineRule="auto"/>
+      </w:pPr>
+      <w:r>
+        <w:rPr>
+          <w:rFonts w:ascii="Noto Serif CJK SC" w:hAnsi="Noto Serif CJK SC" w:eastAsia="Noto Serif CJK SC" w:cs="Noto Serif CJK SC"/>
+          <w:b w:val="0"/>
+          <w:sz w:val="22"/>
+        </w:rPr>
+        <w:t>责任范围对应资料：</w:t>
+      </w:r>
+      <w:r>
+        <w:rPr>
+          <w:rFonts w:ascii="Noto Serif CJK SC" w:hAnsi="Noto Serif CJK SC" w:eastAsia="Noto Serif CJK SC" w:cs="Noto Serif CJK SC"/>
+          <w:b w:val="0"/>
+          <w:sz w:val="22"/>
+        </w:rPr>
+        <w:t>王张文皓见</w:t>
+      </w:r>
+      <w:hyperlink r:id="rIdReportSync1">
+        <w:r>
+          <w:rPr>
+            <w:rFonts w:ascii="Noto Serif CJK SC" w:hAnsi="Noto Serif CJK SC" w:eastAsia="Noto Serif CJK SC" w:cs="Noto Serif CJK SC"/>
+            <w:b w:val="0"/>
+            <w:sz w:val="20"/>
+            <w:color w:val="064C91"/>
+          </w:rPr>
+          <w:t>代码快照</w:t>
+        </w:r>
+      </w:hyperlink>
+      <w:r>
+        <w:rPr>
+          <w:rFonts w:ascii="Noto Serif CJK SC" w:hAnsi="Noto Serif CJK SC" w:eastAsia="Noto Serif CJK SC" w:cs="Noto Serif CJK SC"/>
+          <w:b w:val="0"/>
+          <w:sz w:val="20"/>
+        </w:rPr>
+        <w:t>、</w:t>
+      </w:r>
+      <w:hyperlink r:id="rIdReportSync2">
+        <w:r>
+          <w:rPr>
+            <w:rFonts w:ascii="Noto Serif CJK SC" w:hAnsi="Noto Serif CJK SC" w:eastAsia="Noto Serif CJK SC" w:cs="Noto Serif CJK SC"/>
+            <w:b w:val="0"/>
+            <w:sz w:val="20"/>
+            <w:color w:val="064C91"/>
+          </w:rPr>
+          <w:t>演示说明</w:t>
+        </w:r>
+      </w:hyperlink>
+      <w:r>
+        <w:rPr>
+          <w:rFonts w:ascii="Noto Serif CJK SC" w:hAnsi="Noto Serif CJK SC" w:eastAsia="Noto Serif CJK SC" w:cs="Noto Serif CJK SC"/>
+          <w:b w:val="0"/>
+          <w:sz w:val="22"/>
+        </w:rPr>
+        <w:t>；赵昱淳见</w:t>
+      </w:r>
+      <w:hyperlink r:id="rIdReportSync3">
+        <w:r>
+          <w:rPr>
+            <w:rFonts w:ascii="Noto Serif CJK SC" w:hAnsi="Noto Serif CJK SC" w:eastAsia="Noto Serif CJK SC" w:cs="Noto Serif CJK SC"/>
+            <w:b w:val="0"/>
+            <w:sz w:val="20"/>
+            <w:color w:val="064C91"/>
+          </w:rPr>
+          <w:t>方法与实验协议</w:t>
+        </w:r>
+      </w:hyperlink>
+      <w:r>
+        <w:rPr>
+          <w:rFonts w:ascii="Noto Serif CJK SC" w:hAnsi="Noto Serif CJK SC" w:eastAsia="Noto Serif CJK SC" w:cs="Noto Serif CJK SC"/>
+          <w:b w:val="0"/>
+          <w:sz w:val="20"/>
+        </w:rPr>
+        <w:t>、</w:t>
+      </w:r>
+      <w:hyperlink r:id="rIdReportSync4">
+        <w:r>
+          <w:rPr>
+            <w:rFonts w:ascii="Noto Serif CJK SC" w:hAnsi="Noto Serif CJK SC" w:eastAsia="Noto Serif CJK SC" w:cs="Noto Serif CJK SC"/>
+            <w:b w:val="0"/>
+            <w:sz w:val="20"/>
+            <w:color w:val="064C91"/>
+          </w:rPr>
+          <w:t>阶段决定</w:t>
+        </w:r>
+      </w:hyperlink>
+      <w:r>
+        <w:rPr>
+          <w:rFonts w:ascii="Noto Serif CJK SC" w:hAnsi="Noto Serif CJK SC" w:eastAsia="Noto Serif CJK SC" w:cs="Noto Serif CJK SC"/>
+          <w:b w:val="0"/>
+          <w:sz w:val="22"/>
+        </w:rPr>
+        <w:t>；李以祺见</w:t>
+      </w:r>
+      <w:hyperlink r:id="rIdReportSync5">
+        <w:r>
+          <w:rPr>
+            <w:rFonts w:ascii="Noto Serif CJK SC" w:hAnsi="Noto Serif CJK SC" w:eastAsia="Noto Serif CJK SC" w:cs="Noto Serif CJK SC"/>
+            <w:b w:val="0"/>
+            <w:sz w:val="20"/>
+            <w:color w:val="064C91"/>
+          </w:rPr>
+          <w:t>源码测试</w:t>
+        </w:r>
+      </w:hyperlink>
+      <w:r>
+        <w:rPr>
+          <w:rFonts w:ascii="Noto Serif CJK SC" w:hAnsi="Noto Serif CJK SC" w:eastAsia="Noto Serif CJK SC" w:cs="Noto Serif CJK SC"/>
+          <w:b w:val="0"/>
+          <w:sz w:val="20"/>
+        </w:rPr>
+        <w:t>、</w:t>
+      </w:r>
+      <w:hyperlink r:id="rIdReportSync6">
+        <w:r>
+          <w:rPr>
+            <w:rFonts w:ascii="Noto Serif CJK SC" w:hAnsi="Noto Serif CJK SC" w:eastAsia="Noto Serif CJK SC" w:cs="Noto Serif CJK SC"/>
+            <w:b w:val="0"/>
+            <w:sz w:val="20"/>
+            <w:color w:val="064C91"/>
+          </w:rPr>
+          <w:t>提交检查说明</w:t>
+        </w:r>
+      </w:hyperlink>
+      <w:r>
+        <w:rPr>
+          <w:rFonts w:ascii="Noto Serif CJK SC" w:hAnsi="Noto Serif CJK SC" w:eastAsia="Noto Serif CJK SC" w:cs="Noto Serif CJK SC"/>
+          <w:b w:val="0"/>
+          <w:sz w:val="22"/>
+        </w:rPr>
+        <w:t>；朱逸枫见</w:t>
+      </w:r>
+      <w:hyperlink r:id="rIdReportSync7">
+        <w:r>
+          <w:rPr>
+            <w:rFonts w:ascii="Noto Serif CJK SC" w:hAnsi="Noto Serif CJK SC" w:eastAsia="Noto Serif CJK SC" w:cs="Noto Serif CJK SC"/>
+            <w:b w:val="0"/>
+            <w:sz w:val="20"/>
+            <w:color w:val="064C91"/>
+          </w:rPr>
+          <w:t>发布接手记录</w:t>
+        </w:r>
+      </w:hyperlink>
+      <w:r>
+        <w:rPr>
+          <w:rFonts w:ascii="Noto Serif CJK SC" w:hAnsi="Noto Serif CJK SC" w:eastAsia="Noto Serif CJK SC" w:cs="Noto Serif CJK SC"/>
+          <w:b w:val="0"/>
+          <w:sz w:val="20"/>
+        </w:rPr>
+        <w:t>、</w:t>
+      </w:r>
+      <w:hyperlink r:id="rIdReportSync8">
+        <w:r>
+          <w:rPr>
+            <w:rFonts w:ascii="Noto Serif CJK SC" w:hAnsi="Noto Serif CJK SC" w:eastAsia="Noto Serif CJK SC" w:cs="Noto Serif CJK SC"/>
+            <w:b w:val="0"/>
+            <w:sz w:val="20"/>
+            <w:color w:val="064C91"/>
+          </w:rPr>
+          <w:t>云端回执</w:t>
+        </w:r>
+      </w:hyperlink>
+      <w:r>
+        <w:rPr>
+          <w:rFonts w:ascii="Noto Serif CJK SC" w:hAnsi="Noto Serif CJK SC" w:eastAsia="Noto Serif CJK SC" w:cs="Noto Serif CJK SC"/>
+          <w:b w:val="0"/>
+          <w:sz w:val="22"/>
+        </w:rPr>
+        <w:t>。入口仅供定位，不作个人逐条操作署名。</w:t>
+      </w:r>
+    </w:p>
+    <w:p>
+      <w:pPr>
         <w:pStyle w:val="Heading2"/>
       </w:pPr>
       <w:r>
@@ -7934,11 +9320,6 @@
           <w:sz w:val="22"/>
         </w:rPr>
         <w:t>本项目完成了以真实医学图像分类为载体的AI辅助工程案例。其价值在于把自然语言任务落实为运行、核查、修复和交付，并能指出每项证据支持到哪里。它既不是新医学算法的声明，也不是“AI永不出错”的展示，而是一套保留错误、允许否决、重视来源的课程实践过程。</w:t>
-      </w:r>
-    </w:p>
-    <w:p>
-      <w:r>
-        <w:br w:type="page"/>
       </w:r>
     </w:p>
     <w:p>
@@ -8552,6 +9933,63 @@
           </w:p>
         </w:tc>
       </w:tr>
+      <w:tr>
+        <w:trPr>
+          <w:cantSplit/>
+        </w:trPr>
+        <w:tc>
+          <w:tcPr>
+            <w:tcW w:type="dxa" w:w="2554"/>
+            <w:vAlign w:val="center"/>
+            <w:tcMar>
+              <w:top w:w="72" w:type="dxa"/>
+              <w:bottom w:w="72" w:type="dxa"/>
+              <w:left w:w="85" w:type="dxa"/>
+              <w:right w:w="85" w:type="dxa"/>
+            </w:tcMar>
+            <w:shd w:fill="EFF4FA"/>
+          </w:tcPr>
+          <w:p>
+            <w:pPr>
+              <w:spacing w:before="0" w:after="0" w:line="269" w:lineRule="auto"/>
+            </w:pPr>
+            <w:r>
+              <w:rPr>
+                <w:rFonts w:ascii="Noto Serif CJK SC" w:hAnsi="Noto Serif CJK SC" w:eastAsia="Noto Serif CJK SC" w:cs="Noto Serif CJK SC"/>
+                <w:b w:val="0"/>
+                <w:sz w:val="20"/>
+              </w:rPr>
+              <w:t>S22</w:t>
+            </w:r>
+          </w:p>
+        </w:tc>
+        <w:tc>
+          <w:tcPr>
+            <w:tcW w:type="dxa" w:w="6906"/>
+            <w:vAlign w:val="center"/>
+            <w:tcMar>
+              <w:top w:w="72" w:type="dxa"/>
+              <w:bottom w:w="72" w:type="dxa"/>
+              <w:left w:w="85" w:type="dxa"/>
+              <w:right w:w="85" w:type="dxa"/>
+            </w:tcMar>
+            <w:shd w:fill="EFF4FA"/>
+          </w:tcPr>
+          <w:p>
+            <w:pPr>
+              <w:spacing w:before="0" w:after="0" w:line="269" w:lineRule="auto"/>
+            </w:pPr>
+            <w:r>
+              <w:rPr>
+                <w:rFonts w:ascii="Noto Serif CJK SC" w:hAnsi="Noto Serif CJK SC" w:eastAsia="Noto Serif CJK SC" w:cs="Noto Serif CJK SC"/>
+                <w:b w:val="0"/>
+                <w:sz w:val="20"/>
+              </w:rPr>
+              <w:t>公开交付过程与本次定向同步依据；详见来源索引</w:t>
+            </w:r>
+          </w:p>
+        </w:tc>
+      </w:tr>
     </w:tbl>
     <w:p>
       <w:pPr>
@@ -8592,7 +10030,7 @@
         <w:color w:val="637486"/>
         <w:sz w:val="16"/>
       </w:rPr>
-      <w:t xml:space="preserve">科学证据 d5e4a71 · 提交材料 v1   |   </w:t>
+      <w:t xml:space="preserve">科学证据 d5e4a71 · 文稿 v1.2   |   </w:t>
     </w:r>
     <w:fldSimple w:instr="PAGE">
       <w:r>

</xml_diff>